<commit_message>
docs: add T09 regression section to MVP test report
</commit_message>
<xml_diff>
--- a/docs/test-raporu-MVP-T08.docx
+++ b/docs/test-raporu-MVP-T08.docx
@@ -1717,6 +1717,51 @@
         <w:t>MVP'nin tüm kritik akışları (proje, haftalık rapor, iş kalemi, CTO dashboard) pozitif, negatif, validasyon ve iş kuralı senaryolarıyla test edilmiştir. 44 otomatik test geçmekte, açık kritik hata bulunmamaktadır. Bulunan üç hata (H-1, H-2, H-3) düzeltilmiş ve doğrulanmıştır. Yetkilendirme kaynaklı senaryolar MVP kapsamı dışında bırakılmıştır.</w:t>
       </w:r>
     </w:p>
+    <w:p>
+      <w:pPr>
+        <w:pStyle w:val="Heading1"/>
+      </w:pPr>
+      <w:r>
+        <w:t>7. Regresyon ve Tekrar Test (T09)</w:t>
+      </w:r>
+    </w:p>
+    <w:p>
+      <w:r>
+        <w:t>T09 (16-17. gün) kapsamında MVP'nin kararlılığı doğrulandı. Test turunda (T08) bulunan üç hata zaten önceki task'larda düzeltildiği için bu aşamada açık kritik hata bulunmuyordu; bu nedenle T09 bir düzeltme değil, tekrar test/regresyon aşaması olarak yürütüldü. Tarih: 13 Ağustos 2026.</w:t>
+      </w:r>
+    </w:p>
+    <w:p>
+      <w:pPr>
+        <w:pStyle w:val="ListBullet"/>
+      </w:pPr>
+      <w:r>
+        <w:t>Kapsama iyileştirmesi: Az test edilen 'proje güncelleme' (PUT /api/projects/{id}) yolu için birim testleri eklendi (başarılı güncelleme, olmayan proje 404, olmayan owner 404). Gizli bir hata çıkmadı; yol doğru çalışıyor. Toplam otomatik test sayısı 44'ten 47'ye yükseldi.</w:t>
+      </w:r>
+    </w:p>
+    <w:p>
+      <w:pPr>
+        <w:pStyle w:val="ListBullet"/>
+      </w:pPr>
+      <w:r>
+        <w:t>Regresyon: ./mvnw clean verify -&gt; BUILD SUCCESS, 47 test geçiyor.</w:t>
+      </w:r>
+    </w:p>
+    <w:p>
+      <w:pPr>
+        <w:pStyle w:val="ListBullet"/>
+      </w:pPr>
+      <w:r>
+        <w:t>Fix doğrulaması (canlı): H-1 (raporu olan proje silme -&gt; 409), H-2 (uzun metin -&gt; 400) ve H-3 (geçersiz risk filtresi -&gt; 400) düzeltmeleri tekrar test edildi; üçü de hâlâ geçiyor.</w:t>
+      </w:r>
+    </w:p>
+    <w:p>
+      <w:pPr>
+        <w:pStyle w:val="ListBullet"/>
+      </w:pPr>
+      <w:r>
+        <w:t>Sonuç: MVP stabil, regresyonda yeni sorun yok, açık kritik hata yok. Yetkilendirme kaynaklı senaryolar MVP kapsamı dışındadır.</w:t>
+      </w:r>
+    </w:p>
     <w:sectPr>
       <w:pgSz w:w="12240" w:h="15840"/>
       <w:pgMar w:top="1440" w:right="1800" w:bottom="1440" w:left="1800" w:header="720" w:footer="720" w:gutter="0"/>

</xml_diff>